<commit_message>
chore(data): regenerate manifests, family pages and hub data without the flagship twins
Claude-Session: https://claude.ai/code/session_01YHqT1WoEjsya2h6vR9WxzL
(cherry picked from commit b1adf1a63887a40213ee6a989381ee6bfdfe03d8)
</commit_message>
<xml_diff>
--- a/teacher-tools/activity-guides/1-3-activity-teacher.docx
+++ b/teacher-tools/activity-guides/1-3-activity-teacher.docx
@@ -46,7 +46,7 @@
           <w:sz w:val="20"/>
           <w:szCs w:val="20"/>
         </w:rPr>
-        <w:t xml:space="preserve">Lesson 1-3 — Least Common Multiple  ·  6.NS.4</w:t>
+        <w:t xml:space="preserve">Lesson 1-3 — Least Common Multiple  ·  6.NOS.4</w:t>
       </w:r>
     </w:p>
     <w:p>
@@ -117,7 +117,7 @@
           <w:sz w:val="22"/>
           <w:szCs w:val="22"/>
         </w:rPr>
-        <w:t xml:space="preserve">Stop 1 — Oxygen Bay: The oxygen scrubber cycles every 4 minutes and the air filter cycles every 6 minutes. They both just ran together. After how many minutes do they next run together?</w:t>
+        <w:t xml:space="preserve">One machine runs every 4 min, another every 6 min. They just ran together. In how many minutes do they run together again?</w:t>
       </w:r>
     </w:p>
     <w:p>
@@ -268,7 +268,7 @@
           <w:sz w:val="22"/>
           <w:szCs w:val="22"/>
         </w:rPr>
-        <w:t xml:space="preserve">Stop 2 — Docking Ring: A supply pod arrives every 8 minutes and a cargo shuttle arrives every 12 minutes. They just docked together. After how many minutes do they next dock together?</w:t>
+        <w:t xml:space="preserve">One ship docks every 8 min, another every 12 min. They just docked together. In how many minutes do they dock together again?</w:t>
       </w:r>
     </w:p>
     <w:p>

</xml_diff>